<commit_message>
file upgraded and ready
</commit_message>
<xml_diff>
--- a/capture_texte/fiche en cours de remplissage/Dossier projet Meynadier Renaud.docx
+++ b/capture_texte/fiche en cours de remplissage/Dossier projet Meynadier Renaud.docx
@@ -577,14 +577,7 @@
           <w:sz w:val="24"/>
           <w:szCs w:val="24"/>
         </w:rPr>
-        <w:t>Plus précisément l’équipe</w:t>
-      </w:r>
-      <w:r>
-        <w:rPr>
-          <w:sz w:val="24"/>
-          <w:szCs w:val="24"/>
-        </w:rPr>
-        <w:t xml:space="preserve"> Human Booster qui </w:t>
+        <w:t xml:space="preserve">Plus précisément l’équipe Human Booster qui </w:t>
       </w:r>
       <w:r>
         <w:rPr>
@@ -646,14 +639,7 @@
           <w:sz w:val="24"/>
           <w:szCs w:val="24"/>
         </w:rPr>
-        <w:t>A l’entreprise Be-Ys Software qui est vraiment stimulante</w:t>
-      </w:r>
-      <w:r>
-        <w:rPr>
-          <w:sz w:val="24"/>
-          <w:szCs w:val="24"/>
-        </w:rPr>
-        <w:t>, et est un vrai cadre de paradis pour l’évolution avec des professionnels.</w:t>
+        <w:t>A l’entreprise Be-Ys Software qui est vraiment stimulante, et est un vrai cadre de paradis pour l’évolution avec des professionnels.</w:t>
       </w:r>
     </w:p>
     <w:p>
@@ -814,15 +800,7 @@
           <w:szCs w:val="24"/>
           <w:u w:val="single"/>
         </w:rPr>
-        <w:t xml:space="preserve">Le </w:t>
-      </w:r>
-      <w:r>
-        <w:rPr>
-          <w:sz w:val="24"/>
-          <w:szCs w:val="24"/>
-          <w:u w:val="single"/>
-        </w:rPr>
-        <w:t>stage de Be-Ys Software couvre la partie front du projet</w:t>
+        <w:t>Le stage de Be-Ys Software couvre la partie front du projet</w:t>
       </w:r>
       <w:r>
         <w:rPr>
@@ -888,14 +866,7 @@
           <w:sz w:val="24"/>
           <w:szCs w:val="24"/>
         </w:rPr>
-        <w:t>Réaliser et développer une inter</w:t>
-      </w:r>
-      <w:r>
-        <w:rPr>
-          <w:sz w:val="24"/>
-          <w:szCs w:val="24"/>
-        </w:rPr>
-        <w:t xml:space="preserve">face utilisateur web adaptable statique et dynamique </w:t>
+        <w:t xml:space="preserve">Réaliser et développer une interface utilisateur web adaptable statique et dynamique </w:t>
       </w:r>
     </w:p>
     <w:p>
@@ -1024,14 +995,7 @@
           <w:sz w:val="24"/>
           <w:szCs w:val="24"/>
         </w:rPr>
-        <w:t>Dévelop</w:t>
-      </w:r>
-      <w:r>
-        <w:rPr>
-          <w:sz w:val="24"/>
-          <w:szCs w:val="24"/>
-        </w:rPr>
-        <w:t>per la partie back-end d’une application web ou web mobile</w:t>
+        <w:t>Développer la partie back-end d’une application web ou web mobile</w:t>
       </w:r>
     </w:p>
     <w:p>
@@ -1104,16 +1068,7 @@
           <w:szCs w:val="24"/>
           <w:u w:val="single"/>
         </w:rPr>
-        <w:t>Les technologies abordées en formation sont les</w:t>
-      </w:r>
-      <w:r>
-        <w:rPr>
-          <w:b/>
-          <w:sz w:val="24"/>
-          <w:szCs w:val="24"/>
-          <w:u w:val="single"/>
-        </w:rPr>
-        <w:t xml:space="preserve"> suivantes :  </w:t>
+        <w:t xml:space="preserve">Les technologies abordées en formation sont les suivantes :  </w:t>
       </w:r>
     </w:p>
     <w:p>
@@ -1262,15 +1217,7 @@
           <w:sz w:val="18"/>
           <w:szCs w:val="18"/>
         </w:rPr>
-        <w:t xml:space="preserve">Présentation </w:t>
-      </w:r>
-      <w:r>
-        <w:rPr>
-          <w:b/>
-          <w:sz w:val="18"/>
-          <w:szCs w:val="18"/>
-        </w:rPr>
-        <w:t>du dossier projet …</w:t>
+        <w:t>Présentation du dossier projet …</w:t>
       </w:r>
       <w:r>
         <w:rPr>
@@ -1488,15 +1435,7 @@
           <w:sz w:val="18"/>
           <w:szCs w:val="18"/>
         </w:rPr>
-        <w:t>Résumé………………………………………………………</w:t>
-      </w:r>
-      <w:r>
-        <w:rPr>
-          <w:b/>
-          <w:sz w:val="18"/>
-          <w:szCs w:val="18"/>
-        </w:rPr>
-        <w:t>…………………………………………………</w:t>
+        <w:t>Résumé…………………………………………………………………………………………………………</w:t>
       </w:r>
       <w:proofErr w:type="gramStart"/>
       <w:r>
@@ -1662,15 +1601,7 @@
           <w:sz w:val="18"/>
           <w:szCs w:val="18"/>
         </w:rPr>
-        <w:t>Page 1</w:t>
-      </w:r>
-      <w:r>
-        <w:rPr>
-          <w:b/>
-          <w:sz w:val="18"/>
-          <w:szCs w:val="18"/>
-        </w:rPr>
-        <w:t>7</w:t>
+        <w:t>Page 17</w:t>
       </w:r>
     </w:p>
     <w:p>
@@ -1837,15 +1768,7 @@
           <w:sz w:val="18"/>
           <w:szCs w:val="18"/>
         </w:rPr>
-        <w:t>Résumé……………………………………………………</w:t>
-      </w:r>
-      <w:r>
-        <w:rPr>
-          <w:b/>
-          <w:sz w:val="18"/>
-          <w:szCs w:val="18"/>
-        </w:rPr>
-        <w:t>……………………………………………………</w:t>
+        <w:t>Résumé…………………………………………………………………………………………………………</w:t>
       </w:r>
       <w:proofErr w:type="gramStart"/>
       <w:r>
@@ -2011,15 +1934,7 @@
           <w:sz w:val="18"/>
           <w:szCs w:val="18"/>
         </w:rPr>
-        <w:t xml:space="preserve">Page </w:t>
-      </w:r>
-      <w:r>
-        <w:rPr>
-          <w:b/>
-          <w:sz w:val="18"/>
-          <w:szCs w:val="18"/>
-        </w:rPr>
-        <w:t>26</w:t>
+        <w:t>Page 26</w:t>
       </w:r>
     </w:p>
     <w:p>
@@ -2251,14 +2166,7 @@
           <w:sz w:val="24"/>
           <w:szCs w:val="24"/>
         </w:rPr>
-        <w:t>Be-Almerys, est une entité de plus de 2000 collaborateurs dont 400 en France, qui propose des solutions et services pour le traitement de données, gestion de conformité, distribution de produits, délégation de gestion et la mise en œuvre des services diffé</w:t>
-      </w:r>
-      <w:r>
-        <w:rPr>
-          <w:sz w:val="24"/>
-          <w:szCs w:val="24"/>
-        </w:rPr>
-        <w:t>renciant. C’est un expert de haute technologie appliqué à l’assurance et à la santé. L’entreprise est composée de sous-entités :</w:t>
+        <w:t>Be-Almerys, est une entité de plus de 2000 collaborateurs dont 400 en France, qui propose des solutions et services pour le traitement de données, gestion de conformité, distribution de produits, délégation de gestion et la mise en œuvre des services différenciant. C’est un expert de haute technologie appliqué à l’assurance et à la santé. L’entreprise est composée de sous-entités :</w:t>
       </w:r>
     </w:p>
     <w:p>
@@ -2292,14 +2200,7 @@
           <w:sz w:val="24"/>
           <w:szCs w:val="24"/>
         </w:rPr>
-        <w:t xml:space="preserve">Ses sous-entités ont pour </w:t>
-      </w:r>
-      <w:r>
-        <w:rPr>
-          <w:sz w:val="24"/>
-          <w:szCs w:val="24"/>
-        </w:rPr>
-        <w:t>objectifs de :</w:t>
+        <w:t>Ses sous-entités ont pour objectifs de :</w:t>
       </w:r>
     </w:p>
     <w:p>
@@ -2420,14 +2321,7 @@
           <w:sz w:val="24"/>
           <w:szCs w:val="24"/>
         </w:rPr>
-        <w:t>Sécuriser juridiquement le client lors des prises</w:t>
-      </w:r>
-      <w:r>
-        <w:rPr>
-          <w:sz w:val="24"/>
-          <w:szCs w:val="24"/>
-        </w:rPr>
-        <w:t xml:space="preserve"> d’engagement. </w:t>
+        <w:t xml:space="preserve">Sécuriser juridiquement le client lors des prises d’engagement. </w:t>
       </w:r>
       <w:r>
         <w:rPr>
@@ -2511,86 +2405,72 @@
           <w:sz w:val="24"/>
           <w:szCs w:val="24"/>
         </w:rPr>
-        <w:t>J’ai donc fait un stage dans l’équipe ‘’front’’ au sein de Be</w:t>
-      </w:r>
-      <w:r>
-        <w:rPr>
-          <w:sz w:val="24"/>
-          <w:szCs w:val="24"/>
-        </w:rPr>
-        <w:t>-Ys Software France, Clermont-Ferrand. (Ils sont présents aussi à Paris, Toulouse, Annecy, au Luxembourg et à Tunis).</w:t>
-      </w:r>
-    </w:p>
-    <w:p>
-      <w:pPr>
-        <w:spacing w:before="240" w:after="160" w:line="259" w:lineRule="auto"/>
-        <w:jc w:val="both"/>
-        <w:rPr>
-          <w:sz w:val="24"/>
-          <w:szCs w:val="24"/>
-        </w:rPr>
-      </w:pPr>
-      <w:r>
-        <w:rPr>
-          <w:sz w:val="24"/>
-          <w:szCs w:val="24"/>
-        </w:rPr>
-        <w:t>J’ai travaillé sur une application Angular IAM-FRONT, qui permet la gestion de rôle, de données pour les professionnels de la santé.</w:t>
-      </w:r>
-    </w:p>
-    <w:p>
-      <w:pPr>
-        <w:spacing w:before="240" w:after="160" w:line="259" w:lineRule="auto"/>
-        <w:jc w:val="both"/>
-        <w:rPr>
-          <w:sz w:val="24"/>
-          <w:szCs w:val="24"/>
-        </w:rPr>
-      </w:pPr>
-      <w:r>
-        <w:rPr>
-          <w:sz w:val="24"/>
-          <w:szCs w:val="24"/>
-        </w:rPr>
-        <w:t>En ce</w:t>
-      </w:r>
-      <w:r>
-        <w:rPr>
-          <w:sz w:val="24"/>
-          <w:szCs w:val="24"/>
-        </w:rPr>
-        <w:t xml:space="preserve"> moment l’application est refondue en version 2.0. Les tâches sont divisées en plusieurs Sprint de trois semaines, qui sont eux même divisés en plusieurs tickets. J’ai eu la chance de pouvoir prendre quelques tickets front, des correctifs de modal, de la c</w:t>
-      </w:r>
-      <w:r>
-        <w:rPr>
-          <w:sz w:val="24"/>
-          <w:szCs w:val="24"/>
-        </w:rPr>
-        <w:t>orrection de CSS et l’utilisation de leur librairie Angular.</w:t>
-      </w:r>
-    </w:p>
-    <w:p>
-      <w:pPr>
-        <w:spacing w:before="240" w:after="160" w:line="259" w:lineRule="auto"/>
-        <w:jc w:val="both"/>
-        <w:rPr>
-          <w:sz w:val="24"/>
-          <w:szCs w:val="24"/>
-        </w:rPr>
-      </w:pPr>
-      <w:r>
-        <w:rPr>
-          <w:sz w:val="24"/>
-          <w:szCs w:val="24"/>
-        </w:rPr>
-        <w:t>J’ai eu l’opportunité de corriger quelques problèmes de traduction, de rendre l’interface plus intuitive et facile d’accès. J’ai eu recours à des appels d’API, et des dashboard pour gérer les com</w:t>
-      </w:r>
-      <w:r>
-        <w:rPr>
-          <w:sz w:val="24"/>
-          <w:szCs w:val="24"/>
-        </w:rPr>
-        <w:t>ptes et identifiants.</w:t>
+        <w:t>J’ai donc fait un stage dans l’équipe ‘’front’’ au sein de Be-Ys Software France, Clermont-Ferrand. (Ils sont présents aussi à Paris, Toulouse, Annecy, au Luxembourg et à Tunis).</w:t>
+      </w:r>
+    </w:p>
+    <w:p>
+      <w:pPr>
+        <w:spacing w:before="240" w:after="160" w:line="259" w:lineRule="auto"/>
+        <w:jc w:val="both"/>
+        <w:rPr>
+          <w:sz w:val="24"/>
+          <w:szCs w:val="24"/>
+        </w:rPr>
+      </w:pPr>
+      <w:r>
+        <w:rPr>
+          <w:sz w:val="24"/>
+          <w:szCs w:val="24"/>
+        </w:rPr>
+        <w:t>J’ai travaillé sur une application Angular IAM-FRONT, qui permet la gestion de rôle</w:t>
+      </w:r>
+      <w:r>
+        <w:rPr>
+          <w:sz w:val="24"/>
+          <w:szCs w:val="24"/>
+        </w:rPr>
+        <w:t>s</w:t>
+      </w:r>
+      <w:r>
+        <w:rPr>
+          <w:sz w:val="24"/>
+          <w:szCs w:val="24"/>
+        </w:rPr>
+        <w:t>, de données pour les professionnels de la santé.</w:t>
+      </w:r>
+    </w:p>
+    <w:p>
+      <w:pPr>
+        <w:spacing w:before="240" w:after="160" w:line="259" w:lineRule="auto"/>
+        <w:jc w:val="both"/>
+        <w:rPr>
+          <w:sz w:val="24"/>
+          <w:szCs w:val="24"/>
+        </w:rPr>
+      </w:pPr>
+      <w:r>
+        <w:rPr>
+          <w:sz w:val="24"/>
+          <w:szCs w:val="24"/>
+        </w:rPr>
+        <w:t>En ce moment l’application est refondue en version 2.0. Les tâches sont divisées en plusieurs Sprint de trois semaines, qui sont eux même divisés en plusieurs tickets. J’ai eu la chance de pouvoir prendre quelques tickets front, des correctifs de modal, de la correction de CSS et l’utilisation de leur librairie Angular.</w:t>
+      </w:r>
+    </w:p>
+    <w:p>
+      <w:pPr>
+        <w:spacing w:before="240" w:after="160" w:line="259" w:lineRule="auto"/>
+        <w:jc w:val="both"/>
+        <w:rPr>
+          <w:sz w:val="24"/>
+          <w:szCs w:val="24"/>
+        </w:rPr>
+      </w:pPr>
+      <w:r>
+        <w:rPr>
+          <w:sz w:val="24"/>
+          <w:szCs w:val="24"/>
+        </w:rPr>
+        <w:t>J’ai eu l’opportunité de corriger quelques problèmes de traduction, de rendre l’interface plus intuitive et facile d’accès. J’ai eu recours à des appels d’API, et des dashboard pour gérer les comptes et identifiants.</w:t>
       </w:r>
     </w:p>
     <w:p>
@@ -2624,14 +2504,7 @@
           <w:sz w:val="24"/>
           <w:szCs w:val="24"/>
         </w:rPr>
-        <w:t>Ra</w:t>
-      </w:r>
-      <w:r>
-        <w:rPr>
-          <w:sz w:val="24"/>
-          <w:szCs w:val="24"/>
-        </w:rPr>
-        <w:t>ppel : Le stage ne couvrant pas la partie ‘’back’’ j’ai conçu en parallèle un site de e-commerce : La Nimes’Alerie, que je vous présenterai juste après.</w:t>
+        <w:t>Rappel : Le stage ne couvrant pas la partie ‘’back’’ j’ai conçu en parallèle un site de e-commerce : La Nimes’Alerie, que je vous présenterai juste après.</w:t>
       </w:r>
     </w:p>
     <w:p>
@@ -2684,14 +2557,7 @@
           <w:sz w:val="24"/>
           <w:szCs w:val="24"/>
         </w:rPr>
-        <w:t xml:space="preserve">Dans cette partie je vais vous expliquer comment le cheminement de ce </w:t>
-      </w:r>
-      <w:r>
-        <w:rPr>
-          <w:sz w:val="24"/>
-          <w:szCs w:val="24"/>
-        </w:rPr>
-        <w:t>dossier va s’effectuer.</w:t>
+        <w:t>Dans cette partie je vais vous expliquer comment le cheminement de ce dossier va s’effectuer.</w:t>
       </w:r>
     </w:p>
     <w:p>
@@ -2773,14 +2639,7 @@
           <w:sz w:val="24"/>
           <w:szCs w:val="24"/>
         </w:rPr>
-        <w:t>e</w:t>
-      </w:r>
-      <w:r>
-        <w:rPr>
-          <w:sz w:val="24"/>
-          <w:szCs w:val="24"/>
-        </w:rPr>
-        <w:t>mploi)</w:t>
+        <w:t>emploi)</w:t>
       </w:r>
     </w:p>
     <w:p>
@@ -3344,7 +3203,25 @@
           <w:sz w:val="24"/>
           <w:szCs w:val="24"/>
         </w:rPr>
-        <w:t xml:space="preserve"> en Angular)</w:t>
+        <w:t xml:space="preserve"> en </w:t>
+      </w:r>
+      <w:proofErr w:type="spellStart"/>
+      <w:r>
+        <w:rPr>
+          <w:bCs/>
+          <w:sz w:val="24"/>
+          <w:szCs w:val="24"/>
+        </w:rPr>
+        <w:t>Angular</w:t>
+      </w:r>
+      <w:proofErr w:type="spellEnd"/>
+      <w:r>
+        <w:rPr>
+          <w:bCs/>
+          <w:sz w:val="24"/>
+          <w:szCs w:val="24"/>
+        </w:rPr>
+        <w:t>)</w:t>
       </w:r>
     </w:p>
     <w:p>
@@ -3575,13 +3452,23 @@
           <w:szCs w:val="24"/>
         </w:rPr>
       </w:pPr>
-      <w:r>
-        <w:rPr>
-          <w:bCs/>
-          <w:sz w:val="24"/>
-          <w:szCs w:val="24"/>
-        </w:rPr>
-        <w:t xml:space="preserve">Angular </w:t>
+      <w:proofErr w:type="spellStart"/>
+      <w:r>
+        <w:rPr>
+          <w:bCs/>
+          <w:sz w:val="24"/>
+          <w:szCs w:val="24"/>
+        </w:rPr>
+        <w:t>Angular</w:t>
+      </w:r>
+      <w:proofErr w:type="spellEnd"/>
+      <w:r>
+        <w:rPr>
+          <w:bCs/>
+          <w:sz w:val="24"/>
+          <w:szCs w:val="24"/>
+        </w:rPr>
+        <w:t xml:space="preserve"> </w:t>
       </w:r>
       <w:proofErr w:type="spellStart"/>
       <w:r>
@@ -3808,21 +3695,7 @@
           <w:sz w:val="24"/>
           <w:szCs w:val="24"/>
         </w:rPr>
-        <w:t>Un</w:t>
-      </w:r>
-      <w:r>
-        <w:rPr>
-          <w:sz w:val="24"/>
-          <w:szCs w:val="24"/>
-        </w:rPr>
-        <w:t xml:space="preserve"> IDE pour les langages Web, </w:t>
-      </w:r>
-      <w:r>
-        <w:rPr>
-          <w:sz w:val="24"/>
-          <w:szCs w:val="24"/>
-        </w:rPr>
-        <w:t>adéquat pour Angular. (VS Code également)</w:t>
+        <w:t>Un IDE pour les langages Web, adéquat pour Angular. (VS Code également)</w:t>
       </w:r>
     </w:p>
     <w:p>
@@ -3990,23 +3863,7 @@
           <w:sz w:val="24"/>
           <w:szCs w:val="24"/>
         </w:rPr>
-        <w:t>Ch</w:t>
-      </w:r>
-      <w:r>
-        <w:rPr>
-          <w:bCs/>
-          <w:sz w:val="24"/>
-          <w:szCs w:val="24"/>
-        </w:rPr>
-        <w:t>ocolatey software</w:t>
-      </w:r>
-      <w:r>
-        <w:rPr>
-          <w:bCs/>
-          <w:sz w:val="24"/>
-          <w:szCs w:val="24"/>
-        </w:rPr>
-        <w:t> :</w:t>
+        <w:t>Chocolatey software :</w:t>
       </w:r>
       <w:r>
         <w:rPr>
@@ -5025,39 +4882,7 @@
           <w:sz w:val="24"/>
           <w:szCs w:val="24"/>
         </w:rPr>
-        <w:t xml:space="preserve"> (</w:t>
-      </w:r>
-      <w:r>
-        <w:rPr>
-          <w:bCs/>
-          <w:sz w:val="24"/>
-          <w:szCs w:val="24"/>
-        </w:rPr>
-        <w:t xml:space="preserve">pour que NPM fasse un lien symbolique de ce </w:t>
-      </w:r>
-      <w:r>
-        <w:rPr>
-          <w:bCs/>
-          <w:sz w:val="24"/>
-          <w:szCs w:val="24"/>
-        </w:rPr>
-        <w:t>répertoire</w:t>
-      </w:r>
-      <w:r>
-        <w:rPr>
-          <w:bCs/>
-          <w:sz w:val="24"/>
-          <w:szCs w:val="24"/>
-        </w:rPr>
-        <w:t xml:space="preserve"> vers sa base de </w:t>
-      </w:r>
-      <w:r>
-        <w:rPr>
-          <w:bCs/>
-          <w:sz w:val="24"/>
-          <w:szCs w:val="24"/>
-        </w:rPr>
-        <w:t>dépendance</w:t>
+        <w:t xml:space="preserve"> (pour que NPM fasse un lien symbolique de ce répertoire vers sa base de dépendance</w:t>
       </w:r>
       <w:r>
         <w:rPr>
@@ -5321,7 +5146,7 @@
           <w:sz w:val="28"/>
           <w:szCs w:val="28"/>
         </w:rPr>
-        <w:t>• P</w:t>
+        <w:t>• Présentation du jeu d’essai élaboré par le candidat de la fonctionnalité la plus représentative</w:t>
       </w:r>
       <w:r>
         <w:rPr>
@@ -5330,7 +5155,7 @@
           <w:sz w:val="28"/>
           <w:szCs w:val="28"/>
         </w:rPr>
-        <w:t>résentation du jeu d’essai élaboré par le candidat de la fonctionnalité la plus représentative</w:t>
+        <w:t xml:space="preserve"> </w:t>
       </w:r>
       <w:r>
         <w:rPr>
@@ -5339,120 +5164,123 @@
           <w:sz w:val="28"/>
           <w:szCs w:val="28"/>
         </w:rPr>
-        <w:t xml:space="preserve"> </w:t>
-      </w:r>
-      <w:r>
+        <w:t>(données en entrée, données attendues, données obtenues)</w:t>
+      </w:r>
+    </w:p>
+    <w:p>
+      <w:pPr>
+        <w:spacing w:before="240" w:after="160" w:line="259" w:lineRule="auto"/>
+        <w:jc w:val="both"/>
+        <w:rPr>
+          <w:sz w:val="24"/>
+          <w:szCs w:val="24"/>
+        </w:rPr>
+      </w:pPr>
+      <w:r>
+        <w:rPr>
+          <w:sz w:val="24"/>
+          <w:szCs w:val="24"/>
+        </w:rPr>
+        <w:t xml:space="preserve">Cette rubrique sera </w:t>
+      </w:r>
+      <w:r>
+        <w:rPr>
+          <w:sz w:val="24"/>
+          <w:szCs w:val="24"/>
+        </w:rPr>
+        <w:t>plus étoffée avec le projet fil rouge. Be-Ys ne m’autorise pas à montrer leur projet en dehors de capture d’écran vérifiée. Je n’ai pas le droit par exemple de cloner leur projet sur l’ordinateur d’Human Booster. Après tout c’est cohérent avec la politique de l’entreprise, les données sensibles restent à l’abri.</w:t>
+      </w:r>
+    </w:p>
+    <w:p>
+      <w:pPr>
+        <w:spacing w:before="240" w:after="160" w:line="259" w:lineRule="auto"/>
+        <w:jc w:val="both"/>
+        <w:rPr>
+          <w:sz w:val="24"/>
+          <w:szCs w:val="24"/>
+        </w:rPr>
+      </w:pPr>
+    </w:p>
+    <w:p>
+      <w:pPr>
+        <w:spacing w:before="240" w:after="160" w:line="259" w:lineRule="auto"/>
+        <w:jc w:val="both"/>
+        <w:rPr>
+          <w:sz w:val="24"/>
+          <w:szCs w:val="24"/>
+        </w:rPr>
+      </w:pPr>
+    </w:p>
+    <w:p>
+      <w:pPr>
+        <w:spacing w:before="240" w:after="160" w:line="259" w:lineRule="auto"/>
+        <w:jc w:val="both"/>
+        <w:rPr>
+          <w:sz w:val="24"/>
+          <w:szCs w:val="24"/>
+        </w:rPr>
+      </w:pPr>
+    </w:p>
+    <w:p>
+      <w:pPr>
+        <w:spacing w:before="240" w:after="160" w:line="259" w:lineRule="auto"/>
+        <w:jc w:val="both"/>
+        <w:rPr>
+          <w:sz w:val="24"/>
+          <w:szCs w:val="24"/>
+        </w:rPr>
+      </w:pPr>
+    </w:p>
+    <w:p>
+      <w:pPr>
+        <w:spacing w:before="240" w:after="160" w:line="259" w:lineRule="auto"/>
+        <w:jc w:val="both"/>
+        <w:rPr>
+          <w:sz w:val="24"/>
+          <w:szCs w:val="24"/>
+        </w:rPr>
+      </w:pPr>
+    </w:p>
+    <w:p>
+      <w:pPr>
+        <w:spacing w:before="240" w:after="160" w:line="259" w:lineRule="auto"/>
+        <w:jc w:val="both"/>
+        <w:rPr>
+          <w:sz w:val="24"/>
+          <w:szCs w:val="24"/>
+        </w:rPr>
+      </w:pPr>
+    </w:p>
+    <w:p>
+      <w:pPr>
+        <w:spacing w:before="240" w:after="160" w:line="259" w:lineRule="auto"/>
+        <w:jc w:val="both"/>
+        <w:rPr>
+          <w:sz w:val="24"/>
+          <w:szCs w:val="24"/>
+        </w:rPr>
+      </w:pPr>
+    </w:p>
+    <w:p>
+      <w:pPr>
+        <w:spacing w:before="240" w:after="160" w:line="259" w:lineRule="auto"/>
+        <w:jc w:val="both"/>
+        <w:rPr>
+          <w:sz w:val="24"/>
+          <w:szCs w:val="24"/>
+        </w:rPr>
+      </w:pPr>
+    </w:p>
+    <w:p>
+      <w:pPr>
+        <w:spacing w:before="240" w:after="160" w:line="259" w:lineRule="auto"/>
+        <w:jc w:val="both"/>
         <w:rPr>
           <w:b/>
           <w:bCs/>
           <w:sz w:val="28"/>
           <w:szCs w:val="28"/>
         </w:rPr>
-        <w:t>(données en entrée, données attendues, données obtenues)</w:t>
-      </w:r>
-    </w:p>
-    <w:p>
-      <w:pPr>
-        <w:spacing w:before="240" w:after="160" w:line="259" w:lineRule="auto"/>
-        <w:jc w:val="both"/>
-        <w:rPr>
-          <w:sz w:val="24"/>
-          <w:szCs w:val="24"/>
-        </w:rPr>
-      </w:pPr>
-      <w:r>
-        <w:rPr>
-          <w:sz w:val="24"/>
-          <w:szCs w:val="24"/>
-        </w:rPr>
-        <w:t xml:space="preserve">Cette rubrique sera </w:t>
-      </w:r>
-      <w:r>
-        <w:rPr>
-          <w:sz w:val="24"/>
-          <w:szCs w:val="24"/>
-        </w:rPr>
-        <w:t>plus étoffée avec le projet fil rouge. Be-Ys ne m’autorise pas à montrer leur projet en dehors de capture d’écran vérifiée. Je n’ai pas le droit par exemple de cloner leur projet sur l’ordinateur d’Human Booster. Après tout c’est cohérent avec la politique de l’entreprise, les données sensibles restent à l’abri.</w:t>
-      </w:r>
-    </w:p>
-    <w:p>
-      <w:pPr>
-        <w:spacing w:before="240" w:after="160" w:line="259" w:lineRule="auto"/>
-        <w:jc w:val="both"/>
-        <w:rPr>
-          <w:sz w:val="24"/>
-          <w:szCs w:val="24"/>
-        </w:rPr>
-      </w:pPr>
-    </w:p>
-    <w:p>
-      <w:pPr>
-        <w:spacing w:before="240" w:after="160" w:line="259" w:lineRule="auto"/>
-        <w:jc w:val="both"/>
-        <w:rPr>
-          <w:sz w:val="24"/>
-          <w:szCs w:val="24"/>
-        </w:rPr>
-      </w:pPr>
-    </w:p>
-    <w:p>
-      <w:pPr>
-        <w:spacing w:before="240" w:after="160" w:line="259" w:lineRule="auto"/>
-        <w:jc w:val="both"/>
-        <w:rPr>
-          <w:sz w:val="24"/>
-          <w:szCs w:val="24"/>
-        </w:rPr>
-      </w:pPr>
-    </w:p>
-    <w:p>
-      <w:pPr>
-        <w:spacing w:before="240" w:after="160" w:line="259" w:lineRule="auto"/>
-        <w:jc w:val="both"/>
-        <w:rPr>
-          <w:sz w:val="24"/>
-          <w:szCs w:val="24"/>
-        </w:rPr>
-      </w:pPr>
-    </w:p>
-    <w:p>
-      <w:pPr>
-        <w:spacing w:before="240" w:after="160" w:line="259" w:lineRule="auto"/>
-        <w:jc w:val="both"/>
-        <w:rPr>
-          <w:sz w:val="24"/>
-          <w:szCs w:val="24"/>
-        </w:rPr>
-      </w:pPr>
-    </w:p>
-    <w:p>
-      <w:pPr>
-        <w:spacing w:before="240" w:after="160" w:line="259" w:lineRule="auto"/>
-        <w:jc w:val="both"/>
-        <w:rPr>
-          <w:sz w:val="24"/>
-          <w:szCs w:val="24"/>
-        </w:rPr>
-      </w:pPr>
-    </w:p>
-    <w:p>
-      <w:pPr>
-        <w:spacing w:before="240" w:after="160" w:line="259" w:lineRule="auto"/>
-        <w:jc w:val="both"/>
-        <w:rPr>
-          <w:sz w:val="24"/>
-          <w:szCs w:val="24"/>
-        </w:rPr>
-      </w:pPr>
-    </w:p>
-    <w:p>
-      <w:pPr>
-        <w:spacing w:before="240" w:after="160" w:line="259" w:lineRule="auto"/>
-        <w:jc w:val="both"/>
-        <w:rPr>
-          <w:sz w:val="24"/>
-          <w:szCs w:val="24"/>
-        </w:rPr>
       </w:pPr>
     </w:p>
     <w:p>
@@ -5562,29 +5390,28 @@
           <w:szCs w:val="28"/>
         </w:rPr>
       </w:pPr>
-    </w:p>
-    <w:p>
-      <w:pPr>
-        <w:spacing w:before="240" w:after="160" w:line="259" w:lineRule="auto"/>
-        <w:jc w:val="both"/>
+      <w:r>
         <w:rPr>
           <w:b/>
           <w:bCs/>
           <w:sz w:val="28"/>
           <w:szCs w:val="28"/>
         </w:rPr>
-      </w:pPr>
-      <w:r>
+        <w:lastRenderedPageBreak/>
+        <w:t>• Description de la veille, effectuée par le candidat durant le projet, sur les vulnérabilités de sécurité</w:t>
+      </w:r>
+    </w:p>
+    <w:p>
+      <w:pPr>
+        <w:spacing w:before="240" w:after="160" w:line="259" w:lineRule="auto"/>
+        <w:jc w:val="both"/>
         <w:rPr>
           <w:b/>
           <w:bCs/>
           <w:sz w:val="28"/>
           <w:szCs w:val="28"/>
         </w:rPr>
-        <w:lastRenderedPageBreak/>
-        <w:t xml:space="preserve">• Description de la veille, effectuée par le candidat durant le projet, </w:t>
-      </w:r>
-      <w:proofErr w:type="gramStart"/>
+      </w:pPr>
       <w:r>
         <w:rPr>
           <w:b/>
@@ -5592,9 +5419,8 @@
           <w:sz w:val="28"/>
           <w:szCs w:val="28"/>
         </w:rPr>
-        <w:t>sur</w:t>
-      </w:r>
-      <w:proofErr w:type="gramEnd"/>
+        <w:t>• Description d’une situation de travail ayant nécessité une recherche, effectuée par le candidat</w:t>
+      </w:r>
       <w:r>
         <w:rPr>
           <w:b/>
@@ -5602,20 +5428,17 @@
           <w:sz w:val="28"/>
           <w:szCs w:val="28"/>
         </w:rPr>
-        <w:t xml:space="preserve"> les vulnérabilités de sécurité</w:t>
-      </w:r>
-    </w:p>
-    <w:p>
-      <w:pPr>
-        <w:spacing w:before="240" w:after="160" w:line="259" w:lineRule="auto"/>
-        <w:jc w:val="both"/>
+        <w:t xml:space="preserve"> </w:t>
+      </w:r>
+      <w:r>
         <w:rPr>
           <w:b/>
           <w:bCs/>
           <w:sz w:val="28"/>
           <w:szCs w:val="28"/>
         </w:rPr>
-      </w:pPr>
+        <w:t>durant le projet, à</w:t>
+      </w:r>
       <w:r>
         <w:rPr>
           <w:b/>
@@ -5623,7 +5446,7 @@
           <w:sz w:val="28"/>
           <w:szCs w:val="28"/>
         </w:rPr>
-        <w:t>• Description d’une situation de travail ayant nécessité une recherche, effectuée par le candidat</w:t>
+        <w:t xml:space="preserve"> </w:t>
       </w:r>
       <w:r>
         <w:rPr>
@@ -5632,17 +5455,20 @@
           <w:sz w:val="28"/>
           <w:szCs w:val="28"/>
         </w:rPr>
-        <w:t xml:space="preserve"> </w:t>
-      </w:r>
-      <w:r>
+        <w:t>partir de site anglophone</w:t>
+      </w:r>
+    </w:p>
+    <w:p>
+      <w:pPr>
+        <w:spacing w:before="240" w:after="160" w:line="259" w:lineRule="auto"/>
+        <w:jc w:val="both"/>
         <w:rPr>
           <w:b/>
           <w:bCs/>
           <w:sz w:val="28"/>
           <w:szCs w:val="28"/>
         </w:rPr>
-        <w:t>durant le projet, à</w:t>
-      </w:r>
+      </w:pPr>
       <w:r>
         <w:rPr>
           <w:b/>
@@ -5650,7 +5476,7 @@
           <w:sz w:val="28"/>
           <w:szCs w:val="28"/>
         </w:rPr>
-        <w:t xml:space="preserve"> </w:t>
+        <w:t>• Extrait du site anglophone, utilisé dans le cadre de la recherche décrite précédemment,</w:t>
       </w:r>
       <w:r>
         <w:rPr>
@@ -5659,20 +5485,17 @@
           <w:sz w:val="28"/>
           <w:szCs w:val="28"/>
         </w:rPr>
-        <w:t>partir de site anglophone</w:t>
-      </w:r>
-    </w:p>
-    <w:p>
-      <w:pPr>
-        <w:spacing w:before="240" w:after="160" w:line="259" w:lineRule="auto"/>
-        <w:jc w:val="both"/>
+        <w:t xml:space="preserve"> </w:t>
+      </w:r>
+      <w:r>
         <w:rPr>
           <w:b/>
           <w:bCs/>
           <w:sz w:val="28"/>
           <w:szCs w:val="28"/>
         </w:rPr>
-      </w:pPr>
+        <w:t>accompagné de la traduction en français effectuée par le candidat sans traducteur automatique</w:t>
+      </w:r>
       <w:r>
         <w:rPr>
           <w:b/>
@@ -5680,7 +5503,7 @@
           <w:sz w:val="28"/>
           <w:szCs w:val="28"/>
         </w:rPr>
-        <w:t>• Ex</w:t>
+        <w:t xml:space="preserve"> </w:t>
       </w:r>
       <w:r>
         <w:rPr>
@@ -5689,44 +5512,56 @@
           <w:sz w:val="28"/>
           <w:szCs w:val="28"/>
         </w:rPr>
-        <w:t>trait du site anglophone, utilisé dans le cadre de la recherche décrite précédemment,</w:t>
-      </w:r>
-      <w:r>
+        <w:t>(environ 750 signes)</w:t>
+      </w:r>
+    </w:p>
+    <w:p>
+      <w:pPr>
+        <w:spacing w:before="240" w:after="160" w:line="259" w:lineRule="auto"/>
+        <w:jc w:val="both"/>
         <w:rPr>
           <w:b/>
           <w:bCs/>
           <w:sz w:val="28"/>
           <w:szCs w:val="28"/>
         </w:rPr>
-        <w:t xml:space="preserve"> </w:t>
-      </w:r>
-      <w:r>
+      </w:pPr>
+    </w:p>
+    <w:p>
+      <w:pPr>
+        <w:spacing w:before="240" w:after="160" w:line="259" w:lineRule="auto"/>
+        <w:jc w:val="both"/>
         <w:rPr>
           <w:b/>
           <w:bCs/>
           <w:sz w:val="28"/>
           <w:szCs w:val="28"/>
         </w:rPr>
-        <w:t>accompagné de la traduction en français effectuée par le candidat sans traducteur automatique</w:t>
-      </w:r>
-      <w:r>
+      </w:pPr>
+    </w:p>
+    <w:p>
+      <w:pPr>
+        <w:spacing w:before="240" w:after="160" w:line="259" w:lineRule="auto"/>
+        <w:jc w:val="both"/>
         <w:rPr>
           <w:b/>
           <w:bCs/>
           <w:sz w:val="28"/>
           <w:szCs w:val="28"/>
         </w:rPr>
-        <w:t xml:space="preserve"> </w:t>
-      </w:r>
-      <w:r>
+      </w:pPr>
+    </w:p>
+    <w:p>
+      <w:pPr>
+        <w:spacing w:before="240" w:after="160" w:line="259" w:lineRule="auto"/>
+        <w:jc w:val="both"/>
         <w:rPr>
           <w:b/>
           <w:bCs/>
           <w:sz w:val="28"/>
           <w:szCs w:val="28"/>
         </w:rPr>
-        <w:t>(environ 750 signes)</w:t>
-      </w:r>
+      </w:pPr>
     </w:p>
     <w:p>
       <w:pPr>
@@ -5747,10 +5582,140 @@
         <w:rPr>
           <w:b/>
           <w:bCs/>
+          <w:sz w:val="40"/>
+          <w:szCs w:val="40"/>
+        </w:rPr>
+      </w:pPr>
+    </w:p>
+    <w:p>
+      <w:pPr>
+        <w:spacing w:before="240" w:after="160" w:line="259" w:lineRule="auto"/>
+        <w:jc w:val="both"/>
+        <w:rPr>
+          <w:b/>
+          <w:bCs/>
+          <w:sz w:val="40"/>
+          <w:szCs w:val="40"/>
+        </w:rPr>
+      </w:pPr>
+    </w:p>
+    <w:p>
+      <w:pPr>
+        <w:spacing w:before="240" w:after="160" w:line="259" w:lineRule="auto"/>
+        <w:jc w:val="both"/>
+        <w:rPr>
+          <w:b/>
+          <w:bCs/>
+          <w:sz w:val="40"/>
+          <w:szCs w:val="40"/>
+        </w:rPr>
+      </w:pPr>
+    </w:p>
+    <w:p>
+      <w:pPr>
+        <w:spacing w:before="240" w:after="160" w:line="259" w:lineRule="auto"/>
+        <w:jc w:val="both"/>
+        <w:rPr>
+          <w:b/>
+          <w:bCs/>
+          <w:sz w:val="40"/>
+          <w:szCs w:val="40"/>
+        </w:rPr>
+      </w:pPr>
+    </w:p>
+    <w:p>
+      <w:pPr>
+        <w:spacing w:before="240" w:after="160" w:line="259" w:lineRule="auto"/>
+        <w:jc w:val="both"/>
+        <w:rPr>
+          <w:b/>
+          <w:bCs/>
+          <w:sz w:val="40"/>
+          <w:szCs w:val="40"/>
+        </w:rPr>
+      </w:pPr>
+    </w:p>
+    <w:p>
+      <w:pPr>
+        <w:spacing w:before="240" w:after="160" w:line="259" w:lineRule="auto"/>
+        <w:jc w:val="both"/>
+        <w:rPr>
+          <w:b/>
+          <w:bCs/>
+          <w:sz w:val="40"/>
+          <w:szCs w:val="40"/>
+        </w:rPr>
+      </w:pPr>
+    </w:p>
+    <w:p>
+      <w:pPr>
+        <w:spacing w:before="240" w:after="160" w:line="259" w:lineRule="auto"/>
+        <w:jc w:val="both"/>
+        <w:rPr>
+          <w:b/>
+          <w:bCs/>
+          <w:sz w:val="40"/>
+          <w:szCs w:val="40"/>
+        </w:rPr>
+      </w:pPr>
+    </w:p>
+    <w:p>
+      <w:pPr>
+        <w:spacing w:before="240" w:after="160" w:line="259" w:lineRule="auto"/>
+        <w:jc w:val="both"/>
+        <w:rPr>
+          <w:b/>
+          <w:bCs/>
+          <w:sz w:val="40"/>
+          <w:szCs w:val="40"/>
+        </w:rPr>
+      </w:pPr>
+    </w:p>
+    <w:p>
+      <w:pPr>
+        <w:spacing w:before="240" w:after="160" w:line="259" w:lineRule="auto"/>
+        <w:jc w:val="both"/>
+        <w:rPr>
+          <w:b/>
+          <w:bCs/>
+          <w:sz w:val="40"/>
+          <w:szCs w:val="40"/>
+        </w:rPr>
+      </w:pPr>
+    </w:p>
+    <w:p>
+      <w:pPr>
+        <w:spacing w:before="240" w:after="160" w:line="259" w:lineRule="auto"/>
+        <w:jc w:val="both"/>
+        <w:rPr>
+          <w:b/>
+          <w:bCs/>
+          <w:sz w:val="40"/>
+          <w:szCs w:val="40"/>
+        </w:rPr>
+      </w:pPr>
+    </w:p>
+    <w:p>
+      <w:pPr>
+        <w:spacing w:before="240" w:after="160" w:line="259" w:lineRule="auto"/>
+        <w:jc w:val="both"/>
+        <w:rPr>
+          <w:b/>
+          <w:bCs/>
           <w:sz w:val="28"/>
           <w:szCs w:val="28"/>
         </w:rPr>
       </w:pPr>
+      <w:r>
+        <w:rPr>
+          <w:b/>
+          <w:bCs/>
+          <w:sz w:val="40"/>
+          <w:szCs w:val="40"/>
+        </w:rPr>
+        <w:lastRenderedPageBreak/>
+        <w:t>PARTIE II - Projet fil rouge : La Nimes’Alerie</w:t>
+      </w:r>
     </w:p>
     <w:p>
       <w:pPr>
@@ -5769,184 +5734,6 @@
         <w:spacing w:before="240" w:after="160" w:line="259" w:lineRule="auto"/>
         <w:jc w:val="both"/>
         <w:rPr>
-          <w:b/>
-          <w:bCs/>
-          <w:sz w:val="28"/>
-          <w:szCs w:val="28"/>
-        </w:rPr>
-      </w:pPr>
-    </w:p>
-    <w:p>
-      <w:pPr>
-        <w:spacing w:before="240" w:after="160" w:line="259" w:lineRule="auto"/>
-        <w:jc w:val="both"/>
-        <w:rPr>
-          <w:b/>
-          <w:bCs/>
-          <w:sz w:val="28"/>
-          <w:szCs w:val="28"/>
-        </w:rPr>
-      </w:pPr>
-    </w:p>
-    <w:p>
-      <w:pPr>
-        <w:spacing w:before="240" w:after="160" w:line="259" w:lineRule="auto"/>
-        <w:jc w:val="both"/>
-        <w:rPr>
-          <w:b/>
-          <w:bCs/>
-          <w:sz w:val="40"/>
-          <w:szCs w:val="40"/>
-        </w:rPr>
-      </w:pPr>
-    </w:p>
-    <w:p>
-      <w:pPr>
-        <w:spacing w:before="240" w:after="160" w:line="259" w:lineRule="auto"/>
-        <w:jc w:val="both"/>
-        <w:rPr>
-          <w:b/>
-          <w:bCs/>
-          <w:sz w:val="40"/>
-          <w:szCs w:val="40"/>
-        </w:rPr>
-      </w:pPr>
-    </w:p>
-    <w:p>
-      <w:pPr>
-        <w:spacing w:before="240" w:after="160" w:line="259" w:lineRule="auto"/>
-        <w:jc w:val="both"/>
-        <w:rPr>
-          <w:b/>
-          <w:bCs/>
-          <w:sz w:val="40"/>
-          <w:szCs w:val="40"/>
-        </w:rPr>
-      </w:pPr>
-    </w:p>
-    <w:p>
-      <w:pPr>
-        <w:spacing w:before="240" w:after="160" w:line="259" w:lineRule="auto"/>
-        <w:jc w:val="both"/>
-        <w:rPr>
-          <w:b/>
-          <w:bCs/>
-          <w:sz w:val="40"/>
-          <w:szCs w:val="40"/>
-        </w:rPr>
-      </w:pPr>
-    </w:p>
-    <w:p>
-      <w:pPr>
-        <w:spacing w:before="240" w:after="160" w:line="259" w:lineRule="auto"/>
-        <w:jc w:val="both"/>
-        <w:rPr>
-          <w:b/>
-          <w:bCs/>
-          <w:sz w:val="40"/>
-          <w:szCs w:val="40"/>
-        </w:rPr>
-      </w:pPr>
-    </w:p>
-    <w:p>
-      <w:pPr>
-        <w:spacing w:before="240" w:after="160" w:line="259" w:lineRule="auto"/>
-        <w:jc w:val="both"/>
-        <w:rPr>
-          <w:b/>
-          <w:bCs/>
-          <w:sz w:val="40"/>
-          <w:szCs w:val="40"/>
-        </w:rPr>
-      </w:pPr>
-    </w:p>
-    <w:p>
-      <w:pPr>
-        <w:spacing w:before="240" w:after="160" w:line="259" w:lineRule="auto"/>
-        <w:jc w:val="both"/>
-        <w:rPr>
-          <w:b/>
-          <w:bCs/>
-          <w:sz w:val="40"/>
-          <w:szCs w:val="40"/>
-        </w:rPr>
-      </w:pPr>
-    </w:p>
-    <w:p>
-      <w:pPr>
-        <w:spacing w:before="240" w:after="160" w:line="259" w:lineRule="auto"/>
-        <w:jc w:val="both"/>
-        <w:rPr>
-          <w:b/>
-          <w:bCs/>
-          <w:sz w:val="40"/>
-          <w:szCs w:val="40"/>
-        </w:rPr>
-      </w:pPr>
-    </w:p>
-    <w:p>
-      <w:pPr>
-        <w:spacing w:before="240" w:after="160" w:line="259" w:lineRule="auto"/>
-        <w:jc w:val="both"/>
-        <w:rPr>
-          <w:b/>
-          <w:bCs/>
-          <w:sz w:val="40"/>
-          <w:szCs w:val="40"/>
-        </w:rPr>
-      </w:pPr>
-    </w:p>
-    <w:p>
-      <w:pPr>
-        <w:spacing w:before="240" w:after="160" w:line="259" w:lineRule="auto"/>
-        <w:jc w:val="both"/>
-        <w:rPr>
-          <w:b/>
-          <w:bCs/>
-          <w:sz w:val="40"/>
-          <w:szCs w:val="40"/>
-        </w:rPr>
-      </w:pPr>
-    </w:p>
-    <w:p>
-      <w:pPr>
-        <w:spacing w:before="240" w:after="160" w:line="259" w:lineRule="auto"/>
-        <w:jc w:val="both"/>
-        <w:rPr>
-          <w:b/>
-          <w:bCs/>
-          <w:sz w:val="28"/>
-          <w:szCs w:val="28"/>
-        </w:rPr>
-      </w:pPr>
-      <w:r>
-        <w:rPr>
-          <w:b/>
-          <w:bCs/>
-          <w:sz w:val="40"/>
-          <w:szCs w:val="40"/>
-        </w:rPr>
-        <w:lastRenderedPageBreak/>
-        <w:t>PARTIE II - Projet fil rouge : La Nimes’Alerie</w:t>
-      </w:r>
-    </w:p>
-    <w:p>
-      <w:pPr>
-        <w:spacing w:before="240" w:after="160" w:line="259" w:lineRule="auto"/>
-        <w:jc w:val="both"/>
-        <w:rPr>
-          <w:b/>
-          <w:bCs/>
-          <w:sz w:val="28"/>
-          <w:szCs w:val="28"/>
-        </w:rPr>
-      </w:pPr>
-    </w:p>
-    <w:p>
-      <w:pPr>
-        <w:spacing w:before="240" w:after="160" w:line="259" w:lineRule="auto"/>
-        <w:jc w:val="both"/>
-        <w:rPr>
           <w:sz w:val="24"/>
           <w:szCs w:val="24"/>
         </w:rPr>
@@ -6007,66 +5794,24 @@
           <w:sz w:val="24"/>
           <w:szCs w:val="24"/>
         </w:rPr>
-        <w:t xml:space="preserve">J'ai constaté qu'avec ce projet, on </w:t>
-      </w:r>
-      <w:r>
-        <w:rPr>
-          <w:sz w:val="24"/>
-          <w:szCs w:val="24"/>
-        </w:rPr>
-        <w:t>a</w:t>
-      </w:r>
-      <w:r>
-        <w:rPr>
-          <w:sz w:val="24"/>
-          <w:szCs w:val="24"/>
-        </w:rPr>
-        <w:t xml:space="preserve"> sans cesse de nouvelles idées d'implantation, d'amélioration, je pense que </w:t>
-      </w:r>
-      <w:r>
-        <w:rPr>
-          <w:sz w:val="24"/>
-          <w:szCs w:val="24"/>
-        </w:rPr>
-        <w:t>ce ne sera jamais</w:t>
-      </w:r>
-      <w:r>
-        <w:rPr>
-          <w:sz w:val="24"/>
-          <w:szCs w:val="24"/>
-        </w:rPr>
-        <w:t xml:space="preserve"> parfait.</w:t>
-      </w:r>
-    </w:p>
-    <w:p>
-      <w:pPr>
-        <w:spacing w:before="240" w:after="160" w:line="259" w:lineRule="auto"/>
-        <w:jc w:val="both"/>
-        <w:rPr>
-          <w:sz w:val="24"/>
-          <w:szCs w:val="24"/>
-        </w:rPr>
-      </w:pPr>
-      <w:r>
-        <w:rPr>
-          <w:sz w:val="24"/>
-          <w:szCs w:val="24"/>
-        </w:rPr>
-        <w:t xml:space="preserve">On </w:t>
-      </w:r>
-      <w:r>
-        <w:rPr>
-          <w:sz w:val="24"/>
-          <w:szCs w:val="24"/>
-        </w:rPr>
-        <w:t>peut</w:t>
-      </w:r>
-      <w:r>
-        <w:rPr>
-          <w:sz w:val="24"/>
-          <w:szCs w:val="24"/>
-        </w:rPr>
-        <w:t xml:space="preserve"> parcourir ce site en mode lecture, certaines rubriques seront accessibles que par compte, et certaines que si vous êtes l'administrateur de ce site.</w:t>
+        <w:t>J'ai constaté qu'avec ce projet, on a sans cesse de nouvelles idées d'implantation, d'amélioration, je pense que ce ne sera jamais parfait.</w:t>
+      </w:r>
+    </w:p>
+    <w:p>
+      <w:pPr>
+        <w:spacing w:before="240" w:after="160" w:line="259" w:lineRule="auto"/>
+        <w:jc w:val="both"/>
+        <w:rPr>
+          <w:sz w:val="24"/>
+          <w:szCs w:val="24"/>
+        </w:rPr>
+      </w:pPr>
+      <w:r>
+        <w:rPr>
+          <w:sz w:val="24"/>
+          <w:szCs w:val="24"/>
+        </w:rPr>
+        <w:t>On peut parcourir ce site en mode lecture, certaines rubriques seront accessibles que par compte, et certaines que si vous êtes l'administrateur de ce site.</w:t>
       </w:r>
     </w:p>
     <w:p>
@@ -6110,21 +5855,7 @@
           <w:sz w:val="24"/>
           <w:szCs w:val="24"/>
         </w:rPr>
-        <w:t xml:space="preserve">Le site de la Nimes’Alerie </w:t>
-      </w:r>
-      <w:r>
-        <w:rPr>
-          <w:sz w:val="24"/>
-          <w:szCs w:val="24"/>
-        </w:rPr>
-        <w:t>a</w:t>
-      </w:r>
-      <w:r>
-        <w:rPr>
-          <w:sz w:val="24"/>
-          <w:szCs w:val="24"/>
-        </w:rPr>
-        <w:t xml:space="preserve"> été conçu en parallèle, pendant le temps libre, en toute opportunité. Ci-dessous voici les grands points que j’ai pensé à lister et à finir qui sont parfaitement fonctionnel dans mon site.</w:t>
+        <w:t>Le site de la Nimes’Alerie a été conçu en parallèle, pendant le temps libre, en toute opportunité. Ci-dessous voici les grands points que j’ai pensé à lister et à finir qui sont parfaitement fonctionnel dans mon site.</w:t>
       </w:r>
     </w:p>
     <w:p>
@@ -6160,7 +5891,7 @@
           <w:szCs w:val="24"/>
           <w:u w:val="single"/>
         </w:rPr>
-        <w:t>« </w:t>
+        <w:t>« : effectué »</w:t>
       </w:r>
       <w:r>
         <w:rPr>
@@ -6168,7 +5899,34 @@
           <w:szCs w:val="24"/>
           <w:u w:val="single"/>
         </w:rPr>
-        <w:t>: effectué</w:t>
+        <w:t>.</w:t>
+      </w:r>
+    </w:p>
+    <w:p>
+      <w:pPr>
+        <w:spacing w:before="240" w:after="160" w:line="259" w:lineRule="auto"/>
+        <w:jc w:val="both"/>
+        <w:rPr>
+          <w:sz w:val="24"/>
+          <w:szCs w:val="24"/>
+        </w:rPr>
+      </w:pPr>
+    </w:p>
+    <w:p>
+      <w:pPr>
+        <w:spacing w:before="240" w:after="160" w:line="259" w:lineRule="auto"/>
+        <w:jc w:val="both"/>
+        <w:rPr>
+          <w:sz w:val="24"/>
+          <w:szCs w:val="24"/>
+        </w:rPr>
+      </w:pPr>
+      <w:r>
+        <w:rPr>
+          <w:sz w:val="24"/>
+          <w:szCs w:val="24"/>
+        </w:rPr>
+        <w:t xml:space="preserve">- Création du projet Symfony de la Nimes’Alerie : </w:t>
       </w:r>
       <w:r>
         <w:rPr>
@@ -6176,56 +5934,6 @@
           <w:szCs w:val="24"/>
           <w:u w:val="single"/>
         </w:rPr>
-        <w:t> »</w:t>
-      </w:r>
-      <w:r>
-        <w:rPr>
-          <w:sz w:val="24"/>
-          <w:szCs w:val="24"/>
-          <w:u w:val="single"/>
-        </w:rPr>
-        <w:t>.</w:t>
-      </w:r>
-    </w:p>
-    <w:p>
-      <w:pPr>
-        <w:spacing w:before="240" w:after="160" w:line="259" w:lineRule="auto"/>
-        <w:jc w:val="both"/>
-        <w:rPr>
-          <w:sz w:val="24"/>
-          <w:szCs w:val="24"/>
-        </w:rPr>
-      </w:pPr>
-    </w:p>
-    <w:p>
-      <w:pPr>
-        <w:spacing w:before="240" w:after="160" w:line="259" w:lineRule="auto"/>
-        <w:jc w:val="both"/>
-        <w:rPr>
-          <w:sz w:val="24"/>
-          <w:szCs w:val="24"/>
-        </w:rPr>
-      </w:pPr>
-      <w:r>
-        <w:rPr>
-          <w:sz w:val="24"/>
-          <w:szCs w:val="24"/>
-        </w:rPr>
-        <w:t xml:space="preserve">- Création du projet Symfony de la Nimes’Alerie </w:t>
-      </w:r>
-      <w:r>
-        <w:rPr>
-          <w:sz w:val="24"/>
-          <w:szCs w:val="24"/>
-        </w:rPr>
-        <w:t xml:space="preserve">: </w:t>
-      </w:r>
-      <w:r>
-        <w:rPr>
-          <w:sz w:val="24"/>
-          <w:szCs w:val="24"/>
-          <w:u w:val="single"/>
-        </w:rPr>
         <w:t>effectué</w:t>
       </w:r>
     </w:p>
@@ -6243,14 +5951,7 @@
           <w:sz w:val="24"/>
           <w:szCs w:val="24"/>
         </w:rPr>
-        <w:t xml:space="preserve">- Fabrication de la base de données répondant aux entités du site </w:t>
-      </w:r>
-      <w:r>
-        <w:rPr>
-          <w:sz w:val="24"/>
-          <w:szCs w:val="24"/>
-        </w:rPr>
-        <w:t xml:space="preserve">: </w:t>
+        <w:t xml:space="preserve">- Fabrication de la base de données répondant aux entités du site : </w:t>
       </w:r>
       <w:r>
         <w:rPr>
@@ -7503,10 +7204,7 @@
       <w:jc w:val="center"/>
     </w:pPr>
     <w:r>
-      <w:t>Human Booster DWWM - Meynadier</w:t>
-    </w:r>
-    <w:r>
-      <w:t xml:space="preserve"> Renaud                              </w:t>
+      <w:t xml:space="preserve">Human Booster DWWM - Meynadier Renaud                              </w:t>
     </w:r>
     <w:r>
       <w:tab/>

</xml_diff>